<commit_message>
fixed gen borderaux ,test it to work properly with the appropriate workflow,also made the layout ,more accurate in printing ,got ride of the tables and fit the layout vertically and horizontally
</commit_message>
<xml_diff>
--- a/assets/templates/template.docx
+++ b/assets/templates/template.docx
@@ -2,16 +2,31 @@
 <file path=word/document.xml><?xml version="1.0" encoding="utf-8"?>
 <w:document xmlns:wpc="http://schemas.microsoft.com/office/word/2010/wordprocessingCanvas" xmlns:cx="http://schemas.microsoft.com/office/drawing/2014/chartex" xmlns:cx1="http://schemas.microsoft.com/office/drawing/2015/9/8/chartex" xmlns:cx2="http://schemas.microsoft.com/office/drawing/2015/10/21/chartex" xmlns:cx3="http://schemas.microsoft.com/office/drawing/2016/5/9/chartex" xmlns:cx4="http://schemas.microsoft.com/office/drawing/2016/5/10/chartex" xmlns:cx5="http://schemas.microsoft.com/office/drawing/2016/5/11/chartex" xmlns:cx6="http://schemas.microsoft.com/office/drawing/2016/5/12/chartex" xmlns:cx7="http://schemas.microsoft.com/office/drawing/2016/5/13/chartex" xmlns:cx8="http://schemas.microsoft.com/office/drawing/2016/5/14/chartex" xmlns:mc="http://schemas.openxmlformats.org/markup-compatibility/2006" xmlns:aink="http://schemas.microsoft.com/office/drawing/2016/ink" xmlns:am3d="http://schemas.microsoft.com/office/drawing/2017/model3d" xmlns:o="urn:schemas-microsoft-com:office:office" xmlns:r="http://schemas.openxmlformats.org/officeDocument/2006/relationships" xmlns:m="http://schemas.openxmlformats.org/officeDocument/2006/math" xmlns:v="urn:schemas-microsoft-com:vml" xmlns:wp14="http://schemas.microsoft.com/office/word/2010/wordprocessingDrawing" xmlns:wp="http://schemas.openxmlformats.org/drawingml/2006/wordprocessingDrawing" xmlns:w10="urn:schemas-microsoft-com:office:word" xmlns:w="http://schemas.openxmlformats.org/wordprocessingml/2006/main" xmlns:w14="http://schemas.microsoft.com/office/word/2010/wordml" xmlns:w15="http://schemas.microsoft.com/office/word/2012/wordml" xmlns:w16cid="http://schemas.microsoft.com/office/word/2016/wordml/cid" xmlns:w16se="http://schemas.microsoft.com/office/word/2015/wordml/symex" xmlns:wpg="http://schemas.microsoft.com/office/word/2010/wordprocessingGroup" xmlns:wpi="http://schemas.microsoft.com/office/word/2010/wordprocessingInk" xmlns:wne="http://schemas.microsoft.com/office/word/2006/wordml" xmlns:wps="http://schemas.microsoft.com/office/word/2010/wordprocessingShape" mc:Ignorable="w14 w15 w16se w16cid wp14">
   <w:body>
+    <w:p>
+      <w:bookmarkStart w:id="0" w:name="_GoBack"/>
+      <w:bookmarkEnd w:id="0"/>
+    </w:p>
+    <w:p/>
+    <w:p/>
+    <w:p/>
+    <w:p/>
+    <w:p/>
+    <w:p/>
+    <w:p/>
+    <w:p/>
+    <w:p/>
+    <w:p/>
+    <w:p/>
+    <w:p/>
+    <w:p/>
+    <w:p/>
+    <w:p/>
     <w:p/>
     <w:sectPr>
-      <w:headerReference w:type="even" r:id="rId6"/>
       <w:headerReference w:type="default" r:id="rId7"/>
-      <w:footerReference w:type="even" r:id="rId8"/>
-      <w:footerReference w:type="default" r:id="rId9"/>
-      <w:headerReference w:type="first" r:id="rId10"/>
-      <w:footerReference w:type="first" r:id="rId11"/>
+      <w:footerReference w:type="default" r:id="rId8"/>
       <w:pgSz w:w="11906" w:h="16838"/>
-      <w:pgMar w:top="2519" w:right="424" w:bottom="1417" w:left="1276" w:header="1135" w:footer="708" w:gutter="0"/>
+      <w:pgMar w:top="1872" w:right="425" w:bottom="1418" w:left="1276" w:header="851" w:footer="1527" w:gutter="0"/>
       <w:cols w:space="708"/>
       <w:docGrid w:linePitch="360"/>
     </w:sectPr>
@@ -42,18 +57,10 @@
 <w:ftr xmlns:wpc="http://schemas.microsoft.com/office/word/2010/wordprocessingCanvas" xmlns:cx="http://schemas.microsoft.com/office/drawing/2014/chartex" xmlns:cx1="http://schemas.microsoft.com/office/drawing/2015/9/8/chartex" xmlns:cx2="http://schemas.microsoft.com/office/drawing/2015/10/21/chartex" xmlns:cx3="http://schemas.microsoft.com/office/drawing/2016/5/9/chartex" xmlns:cx4="http://schemas.microsoft.com/office/drawing/2016/5/10/chartex" xmlns:cx5="http://schemas.microsoft.com/office/drawing/2016/5/11/chartex" xmlns:cx6="http://schemas.microsoft.com/office/drawing/2016/5/12/chartex" xmlns:cx7="http://schemas.microsoft.com/office/drawing/2016/5/13/chartex" xmlns:cx8="http://schemas.microsoft.com/office/drawing/2016/5/14/chartex" xmlns:mc="http://schemas.openxmlformats.org/markup-compatibility/2006" xmlns:aink="http://schemas.microsoft.com/office/drawing/2016/ink" xmlns:am3d="http://schemas.microsoft.com/office/drawing/2017/model3d" xmlns:o="urn:schemas-microsoft-com:office:office" xmlns:r="http://schemas.openxmlformats.org/officeDocument/2006/relationships" xmlns:m="http://schemas.openxmlformats.org/officeDocument/2006/math" xmlns:v="urn:schemas-microsoft-com:vml" xmlns:wp14="http://schemas.microsoft.com/office/word/2010/wordprocessingDrawing" xmlns:wp="http://schemas.openxmlformats.org/drawingml/2006/wordprocessingDrawing" xmlns:w10="urn:schemas-microsoft-com:office:word" xmlns:w="http://schemas.openxmlformats.org/wordprocessingml/2006/main" xmlns:w14="http://schemas.microsoft.com/office/word/2010/wordml" xmlns:w15="http://schemas.microsoft.com/office/word/2012/wordml" xmlns:w16cid="http://schemas.microsoft.com/office/word/2016/wordml/cid" xmlns:w16se="http://schemas.microsoft.com/office/word/2015/wordml/symex" xmlns:wpg="http://schemas.microsoft.com/office/word/2010/wordprocessingGroup" xmlns:wpi="http://schemas.microsoft.com/office/word/2010/wordprocessingInk" xmlns:wne="http://schemas.microsoft.com/office/word/2006/wordml" xmlns:wps="http://schemas.microsoft.com/office/word/2010/wordprocessingShape" mc:Ignorable="w14 w15 w16se w16cid wp14">
   <w:p>
     <w:pPr>
-      <w:pStyle w:val="Footer"/>
-    </w:pPr>
-  </w:p>
-</w:ftr>
-</file>
-
-<file path=word/footer2.xml><?xml version="1.0" encoding="utf-8"?>
-<w:ftr xmlns:wpc="http://schemas.microsoft.com/office/word/2010/wordprocessingCanvas" xmlns:cx="http://schemas.microsoft.com/office/drawing/2014/chartex" xmlns:cx1="http://schemas.microsoft.com/office/drawing/2015/9/8/chartex" xmlns:cx2="http://schemas.microsoft.com/office/drawing/2015/10/21/chartex" xmlns:cx3="http://schemas.microsoft.com/office/drawing/2016/5/9/chartex" xmlns:cx4="http://schemas.microsoft.com/office/drawing/2016/5/10/chartex" xmlns:cx5="http://schemas.microsoft.com/office/drawing/2016/5/11/chartex" xmlns:cx6="http://schemas.microsoft.com/office/drawing/2016/5/12/chartex" xmlns:cx7="http://schemas.microsoft.com/office/drawing/2016/5/13/chartex" xmlns:cx8="http://schemas.microsoft.com/office/drawing/2016/5/14/chartex" xmlns:mc="http://schemas.openxmlformats.org/markup-compatibility/2006" xmlns:aink="http://schemas.microsoft.com/office/drawing/2016/ink" xmlns:am3d="http://schemas.microsoft.com/office/drawing/2017/model3d" xmlns:o="urn:schemas-microsoft-com:office:office" xmlns:r="http://schemas.openxmlformats.org/officeDocument/2006/relationships" xmlns:m="http://schemas.openxmlformats.org/officeDocument/2006/math" xmlns:v="urn:schemas-microsoft-com:vml" xmlns:wp14="http://schemas.microsoft.com/office/word/2010/wordprocessingDrawing" xmlns:wp="http://schemas.openxmlformats.org/drawingml/2006/wordprocessingDrawing" xmlns:w10="urn:schemas-microsoft-com:office:word" xmlns:w="http://schemas.openxmlformats.org/wordprocessingml/2006/main" xmlns:w14="http://schemas.microsoft.com/office/word/2010/wordml" xmlns:w15="http://schemas.microsoft.com/office/word/2012/wordml" xmlns:w16cid="http://schemas.microsoft.com/office/word/2016/wordml/cid" xmlns:w16se="http://schemas.microsoft.com/office/word/2015/wordml/symex" xmlns:wpg="http://schemas.microsoft.com/office/word/2010/wordprocessingGroup" xmlns:wpi="http://schemas.microsoft.com/office/word/2010/wordprocessingInk" xmlns:wne="http://schemas.microsoft.com/office/word/2006/wordml" xmlns:wps="http://schemas.microsoft.com/office/word/2010/wordprocessingShape" mc:Ignorable="w14 w15 w16se w16cid wp14">
-  <w:p>
-    <w:pPr>
-      <w:ind w:left="540"/>
-      <w:jc w:val="right"/>
+      <w:tabs>
+        <w:tab w:val="left" w:pos="7695"/>
+        <w:tab w:val="right" w:pos="10206"/>
+      </w:tabs>
       <w:rPr>
         <w:rFonts w:ascii="Book Antiqua" w:hAnsi="Book Antiqua" w:cs="Arial"/>
         <w:b/>
@@ -63,6 +70,14 @@
         <w:szCs w:val="22"/>
       </w:rPr>
     </w:pPr>
+    <w:r>
+      <w:rPr>
+        <w:b/>
+        <w:bCs/>
+        <w:color w:val="000000"/>
+      </w:rPr>
+      <w:t xml:space="preserve">                                                                                                                     </w:t>
+    </w:r>
     <w:proofErr w:type="spellStart"/>
     <w:r>
       <w:rPr>
@@ -106,7 +121,7 @@
         <w:bCs/>
         <w:color w:val="000000"/>
       </w:rPr>
-      <w:t xml:space="preserve">00/ </w:t>
+      <w:t>00</w:t>
     </w:r>
     <w:r>
       <w:rPr>
@@ -114,10 +129,32 @@
         <w:bCs/>
         <w:color w:val="000000"/>
       </w:rPr>
-      <w:t xml:space="preserve"> /202</w:t>
-    </w:r>
-    <w:bookmarkStart w:id="0" w:name="_GoBack"/>
-    <w:bookmarkEnd w:id="0"/>
+      <w:t>/</w:t>
+    </w:r>
+    <w:r>
+      <w:rPr>
+        <w:b/>
+        <w:bCs/>
+        <w:color w:val="000000"/>
+      </w:rPr>
+      <w:t>00</w:t>
+    </w:r>
+    <w:r>
+      <w:rPr>
+        <w:b/>
+        <w:bCs/>
+        <w:color w:val="000000"/>
+      </w:rPr>
+      <w:t>/20</w:t>
+    </w:r>
+    <w:r>
+      <w:rPr>
+        <w:b/>
+        <w:bCs/>
+        <w:color w:val="000000"/>
+      </w:rPr>
+      <w:t>XX</w:t>
+    </w:r>
   </w:p>
   <w:p>
     <w:pPr>
@@ -205,16 +242,6 @@
       </w:rPr>
       <w:t xml:space="preserve"> Operations directorate</w:t>
     </w:r>
-  </w:p>
-</w:ftr>
-</file>
-
-<file path=word/footer3.xml><?xml version="1.0" encoding="utf-8"?>
-<w:ftr xmlns:wpc="http://schemas.microsoft.com/office/word/2010/wordprocessingCanvas" xmlns:cx="http://schemas.microsoft.com/office/drawing/2014/chartex" xmlns:cx1="http://schemas.microsoft.com/office/drawing/2015/9/8/chartex" xmlns:cx2="http://schemas.microsoft.com/office/drawing/2015/10/21/chartex" xmlns:cx3="http://schemas.microsoft.com/office/drawing/2016/5/9/chartex" xmlns:cx4="http://schemas.microsoft.com/office/drawing/2016/5/10/chartex" xmlns:cx5="http://schemas.microsoft.com/office/drawing/2016/5/11/chartex" xmlns:cx6="http://schemas.microsoft.com/office/drawing/2016/5/12/chartex" xmlns:cx7="http://schemas.microsoft.com/office/drawing/2016/5/13/chartex" xmlns:cx8="http://schemas.microsoft.com/office/drawing/2016/5/14/chartex" xmlns:mc="http://schemas.openxmlformats.org/markup-compatibility/2006" xmlns:aink="http://schemas.microsoft.com/office/drawing/2016/ink" xmlns:am3d="http://schemas.microsoft.com/office/drawing/2017/model3d" xmlns:o="urn:schemas-microsoft-com:office:office" xmlns:r="http://schemas.openxmlformats.org/officeDocument/2006/relationships" xmlns:m="http://schemas.openxmlformats.org/officeDocument/2006/math" xmlns:v="urn:schemas-microsoft-com:vml" xmlns:wp14="http://schemas.microsoft.com/office/word/2010/wordprocessingDrawing" xmlns:wp="http://schemas.openxmlformats.org/drawingml/2006/wordprocessingDrawing" xmlns:w10="urn:schemas-microsoft-com:office:word" xmlns:w="http://schemas.openxmlformats.org/wordprocessingml/2006/main" xmlns:w14="http://schemas.microsoft.com/office/word/2010/wordml" xmlns:w15="http://schemas.microsoft.com/office/word/2012/wordml" xmlns:w16cid="http://schemas.microsoft.com/office/word/2016/wordml/cid" xmlns:w16se="http://schemas.microsoft.com/office/word/2015/wordml/symex" xmlns:wpg="http://schemas.microsoft.com/office/word/2010/wordprocessingGroup" xmlns:wpi="http://schemas.microsoft.com/office/word/2010/wordprocessingInk" xmlns:wne="http://schemas.microsoft.com/office/word/2006/wordml" xmlns:wps="http://schemas.microsoft.com/office/word/2010/wordprocessingShape" mc:Ignorable="w14 w15 w16se w16cid wp14">
-  <w:p>
-    <w:pPr>
-      <w:pStyle w:val="Footer"/>
-    </w:pPr>
   </w:p>
 </w:ftr>
 </file>
@@ -240,21 +267,11 @@
 
 <file path=word/header1.xml><?xml version="1.0" encoding="utf-8"?>
 <w:hdr xmlns:wpc="http://schemas.microsoft.com/office/word/2010/wordprocessingCanvas" xmlns:cx="http://schemas.microsoft.com/office/drawing/2014/chartex" xmlns:cx1="http://schemas.microsoft.com/office/drawing/2015/9/8/chartex" xmlns:cx2="http://schemas.microsoft.com/office/drawing/2015/10/21/chartex" xmlns:cx3="http://schemas.microsoft.com/office/drawing/2016/5/9/chartex" xmlns:cx4="http://schemas.microsoft.com/office/drawing/2016/5/10/chartex" xmlns:cx5="http://schemas.microsoft.com/office/drawing/2016/5/11/chartex" xmlns:cx6="http://schemas.microsoft.com/office/drawing/2016/5/12/chartex" xmlns:cx7="http://schemas.microsoft.com/office/drawing/2016/5/13/chartex" xmlns:cx8="http://schemas.microsoft.com/office/drawing/2016/5/14/chartex" xmlns:mc="http://schemas.openxmlformats.org/markup-compatibility/2006" xmlns:aink="http://schemas.microsoft.com/office/drawing/2016/ink" xmlns:am3d="http://schemas.microsoft.com/office/drawing/2017/model3d" xmlns:o="urn:schemas-microsoft-com:office:office" xmlns:r="http://schemas.openxmlformats.org/officeDocument/2006/relationships" xmlns:m="http://schemas.openxmlformats.org/officeDocument/2006/math" xmlns:v="urn:schemas-microsoft-com:vml" xmlns:wp14="http://schemas.microsoft.com/office/word/2010/wordprocessingDrawing" xmlns:wp="http://schemas.openxmlformats.org/drawingml/2006/wordprocessingDrawing" xmlns:w10="urn:schemas-microsoft-com:office:word" xmlns:w="http://schemas.openxmlformats.org/wordprocessingml/2006/main" xmlns:w14="http://schemas.microsoft.com/office/word/2010/wordml" xmlns:w15="http://schemas.microsoft.com/office/word/2012/wordml" xmlns:w16cid="http://schemas.microsoft.com/office/word/2016/wordml/cid" xmlns:w16se="http://schemas.microsoft.com/office/word/2015/wordml/symex" xmlns:wpg="http://schemas.microsoft.com/office/word/2010/wordprocessingGroup" xmlns:wpi="http://schemas.microsoft.com/office/word/2010/wordprocessingInk" xmlns:wne="http://schemas.microsoft.com/office/word/2006/wordml" xmlns:wps="http://schemas.microsoft.com/office/word/2010/wordprocessingShape" mc:Ignorable="w14 w15 w16se w16cid wp14">
-  <w:p>
-    <w:pPr>
-      <w:pStyle w:val="Header"/>
-    </w:pPr>
-  </w:p>
-</w:hdr>
-</file>
-
-<file path=word/header2.xml><?xml version="1.0" encoding="utf-8"?>
-<w:hdr xmlns:wpc="http://schemas.microsoft.com/office/word/2010/wordprocessingCanvas" xmlns:cx="http://schemas.microsoft.com/office/drawing/2014/chartex" xmlns:cx1="http://schemas.microsoft.com/office/drawing/2015/9/8/chartex" xmlns:cx2="http://schemas.microsoft.com/office/drawing/2015/10/21/chartex" xmlns:cx3="http://schemas.microsoft.com/office/drawing/2016/5/9/chartex" xmlns:cx4="http://schemas.microsoft.com/office/drawing/2016/5/10/chartex" xmlns:cx5="http://schemas.microsoft.com/office/drawing/2016/5/11/chartex" xmlns:cx6="http://schemas.microsoft.com/office/drawing/2016/5/12/chartex" xmlns:cx7="http://schemas.microsoft.com/office/drawing/2016/5/13/chartex" xmlns:cx8="http://schemas.microsoft.com/office/drawing/2016/5/14/chartex" xmlns:mc="http://schemas.openxmlformats.org/markup-compatibility/2006" xmlns:aink="http://schemas.microsoft.com/office/drawing/2016/ink" xmlns:am3d="http://schemas.microsoft.com/office/drawing/2017/model3d" xmlns:o="urn:schemas-microsoft-com:office:office" xmlns:r="http://schemas.openxmlformats.org/officeDocument/2006/relationships" xmlns:m="http://schemas.openxmlformats.org/officeDocument/2006/math" xmlns:v="urn:schemas-microsoft-com:vml" xmlns:wp14="http://schemas.microsoft.com/office/word/2010/wordprocessingDrawing" xmlns:wp="http://schemas.openxmlformats.org/drawingml/2006/wordprocessingDrawing" xmlns:w10="urn:schemas-microsoft-com:office:word" xmlns:w="http://schemas.openxmlformats.org/wordprocessingml/2006/main" xmlns:w14="http://schemas.microsoft.com/office/word/2010/wordml" xmlns:w15="http://schemas.microsoft.com/office/word/2012/wordml" xmlns:w16cid="http://schemas.microsoft.com/office/word/2016/wordml/cid" xmlns:w16se="http://schemas.microsoft.com/office/word/2015/wordml/symex" xmlns:wpg="http://schemas.microsoft.com/office/word/2010/wordprocessingGroup" xmlns:wpi="http://schemas.microsoft.com/office/word/2010/wordprocessingInk" xmlns:wne="http://schemas.microsoft.com/office/word/2006/wordml" xmlns:wps="http://schemas.microsoft.com/office/word/2010/wordprocessingShape" mc:Ignorable="w14 w15 w16se w16cid wp14">
   <w:tbl>
     <w:tblPr>
       <w:tblpPr w:leftFromText="180" w:rightFromText="180" w:vertAnchor="text" w:horzAnchor="margin" w:tblpY="-704"/>
       <w:tblOverlap w:val="never"/>
-      <w:tblW w:w="10015" w:type="dxa"/>
+      <w:tblW w:w="9908" w:type="dxa"/>
       <w:tblBorders>
         <w:top w:val="single" w:sz="4" w:space="0" w:color="auto"/>
         <w:left w:val="single" w:sz="4" w:space="0" w:color="auto"/>
@@ -266,18 +283,18 @@
       <w:tblLook w:val="01E0" w:firstRow="1" w:lastRow="1" w:firstColumn="1" w:lastColumn="1" w:noHBand="0" w:noVBand="0"/>
     </w:tblPr>
     <w:tblGrid>
-      <w:gridCol w:w="2444"/>
-      <w:gridCol w:w="5165"/>
-      <w:gridCol w:w="2406"/>
+      <w:gridCol w:w="1506"/>
+      <w:gridCol w:w="5265"/>
+      <w:gridCol w:w="3137"/>
     </w:tblGrid>
     <w:tr>
       <w:trPr>
         <w:cantSplit/>
-        <w:trHeight w:val="177"/>
+        <w:trHeight w:val="167"/>
       </w:trPr>
       <w:tc>
         <w:tcPr>
-          <w:tcW w:w="2444" w:type="dxa"/>
+          <w:tcW w:w="1506" w:type="dxa"/>
           <w:vMerge w:val="restart"/>
           <w:tcBorders>
             <w:top w:val="single" w:sz="4" w:space="0" w:color="auto"/>
@@ -290,6 +307,7 @@
         </w:tcPr>
         <w:p>
           <w:pPr>
+            <w:spacing w:before="240"/>
             <w:jc w:val="center"/>
             <w:rPr>
               <w:b/>
@@ -303,10 +321,18 @@
               <w:noProof/>
             </w:rPr>
             <w:drawing>
-              <wp:inline distT="0" distB="0" distL="0" distR="0">
+              <wp:anchor distT="0" distB="0" distL="114300" distR="114300" simplePos="0" relativeHeight="251663872" behindDoc="0" locked="0" layoutInCell="1" allowOverlap="1">
+                <wp:simplePos x="0" y="0"/>
+                <wp:positionH relativeFrom="column">
+                  <wp:posOffset>19685</wp:posOffset>
+                </wp:positionH>
+                <wp:positionV relativeFrom="paragraph">
+                  <wp:posOffset>-8255</wp:posOffset>
+                </wp:positionV>
                 <wp:extent cx="790575" cy="723900"/>
-                <wp:effectExtent l="19050" t="0" r="9525" b="0"/>
-                <wp:docPr id="5" name="Image 4" descr="LOGO.png"/>
+                <wp:effectExtent l="0" t="0" r="0" b="0"/>
+                <wp:wrapNone/>
+                <wp:docPr id="63" name="Image 4" descr="LOGO.png"/>
                 <wp:cNvGraphicFramePr>
                   <a:graphicFrameLocks xmlns:a="http://schemas.openxmlformats.org/drawingml/2006/main" noChangeAspect="1"/>
                 </wp:cNvGraphicFramePr>
@@ -320,7 +346,13 @@
                         </pic:cNvPicPr>
                       </pic:nvPicPr>
                       <pic:blipFill>
-                        <a:blip r:embed="rId1"/>
+                        <a:blip r:embed="rId1">
+                          <a:extLst>
+                            <a:ext uri="{28A0092B-C50C-407E-A947-70E740481C1C}">
+                              <a14:useLocalDpi xmlns:a14="http://schemas.microsoft.com/office/drawing/2010/main" val="0"/>
+                            </a:ext>
+                          </a:extLst>
+                        </a:blip>
                         <a:srcRect/>
                         <a:stretch>
                           <a:fillRect/>
@@ -345,14 +377,20 @@
                     </pic:pic>
                   </a:graphicData>
                 </a:graphic>
-              </wp:inline>
+                <wp14:sizeRelH relativeFrom="margin">
+                  <wp14:pctWidth>0</wp14:pctWidth>
+                </wp14:sizeRelH>
+                <wp14:sizeRelV relativeFrom="margin">
+                  <wp14:pctHeight>0</wp14:pctHeight>
+                </wp14:sizeRelV>
+              </wp:anchor>
             </w:drawing>
           </w:r>
         </w:p>
       </w:tc>
       <w:tc>
         <w:tcPr>
-          <w:tcW w:w="5165" w:type="dxa"/>
+          <w:tcW w:w="5265" w:type="dxa"/>
           <w:tcBorders>
             <w:top w:val="single" w:sz="4" w:space="0" w:color="auto"/>
             <w:left w:val="single" w:sz="4" w:space="0" w:color="auto"/>
@@ -363,7 +401,7 @@
         </w:tcPr>
         <w:p>
           <w:pPr>
-            <w:spacing w:line="276" w:lineRule="auto"/>
+            <w:spacing w:before="240" w:line="360" w:lineRule="auto"/>
             <w:jc w:val="center"/>
             <w:rPr>
               <w:b/>
@@ -372,24 +410,12 @@
               <w:szCs w:val="26"/>
             </w:rPr>
           </w:pPr>
-        </w:p>
-        <w:p>
-          <w:pPr>
-            <w:spacing w:line="276" w:lineRule="auto"/>
-            <w:jc w:val="center"/>
-            <w:rPr>
-              <w:b/>
-              <w:bCs/>
-              <w:sz w:val="26"/>
-              <w:szCs w:val="26"/>
-            </w:rPr>
-          </w:pPr>
-          <w:r>
-            <w:rPr>
-              <w:b/>
-              <w:bCs/>
-              <w:sz w:val="26"/>
-              <w:szCs w:val="26"/>
+          <w:r>
+            <w:rPr>
+              <w:b/>
+              <w:bCs/>
+              <w:sz w:val="28"/>
+              <w:szCs w:val="28"/>
             </w:rPr>
             <w:t>Système de Management de la Qualité</w:t>
           </w:r>
@@ -397,7 +423,100 @@
       </w:tc>
       <w:tc>
         <w:tcPr>
-          <w:tcW w:w="2406" w:type="dxa"/>
+          <w:tcW w:w="3137" w:type="dxa"/>
+          <w:tcBorders>
+            <w:top w:val="single" w:sz="4" w:space="0" w:color="auto"/>
+            <w:left w:val="single" w:sz="4" w:space="0" w:color="auto"/>
+            <w:bottom w:val="single" w:sz="4" w:space="0" w:color="auto"/>
+            <w:right w:val="single" w:sz="4" w:space="0" w:color="auto"/>
+          </w:tcBorders>
+          <w:vAlign w:val="center"/>
+          <w:hideMark/>
+        </w:tcPr>
+        <w:p>
+          <w:pPr>
+            <w:spacing w:before="240" w:line="360" w:lineRule="auto"/>
+            <w:rPr>
+              <w:sz w:val="26"/>
+              <w:szCs w:val="26"/>
+            </w:rPr>
+          </w:pPr>
+          <w:r>
+            <w:rPr>
+              <w:sz w:val="26"/>
+              <w:szCs w:val="26"/>
+            </w:rPr>
+            <w:t>Code : ERG 05/08-a</w:t>
+          </w:r>
+        </w:p>
+      </w:tc>
+    </w:tr>
+    <w:tr>
+      <w:trPr>
+        <w:cantSplit/>
+        <w:trHeight w:val="167"/>
+      </w:trPr>
+      <w:tc>
+        <w:tcPr>
+          <w:tcW w:w="1506" w:type="dxa"/>
+          <w:vMerge/>
+          <w:tcBorders>
+            <w:top w:val="single" w:sz="4" w:space="0" w:color="auto"/>
+            <w:left w:val="single" w:sz="4" w:space="0" w:color="auto"/>
+            <w:bottom w:val="single" w:sz="4" w:space="0" w:color="auto"/>
+            <w:right w:val="single" w:sz="4" w:space="0" w:color="auto"/>
+          </w:tcBorders>
+          <w:vAlign w:val="center"/>
+          <w:hideMark/>
+        </w:tcPr>
+        <w:p>
+          <w:pPr>
+            <w:rPr>
+              <w:b/>
+              <w:bCs/>
+              <w:sz w:val="28"/>
+              <w:szCs w:val="28"/>
+            </w:rPr>
+          </w:pPr>
+        </w:p>
+      </w:tc>
+      <w:tc>
+        <w:tcPr>
+          <w:tcW w:w="5265" w:type="dxa"/>
+          <w:vMerge w:val="restart"/>
+          <w:tcBorders>
+            <w:top w:val="single" w:sz="4" w:space="0" w:color="auto"/>
+            <w:left w:val="single" w:sz="4" w:space="0" w:color="auto"/>
+            <w:bottom w:val="single" w:sz="4" w:space="0" w:color="auto"/>
+            <w:right w:val="single" w:sz="4" w:space="0" w:color="auto"/>
+          </w:tcBorders>
+          <w:vAlign w:val="center"/>
+        </w:tcPr>
+        <w:p>
+          <w:pPr>
+            <w:spacing w:before="240" w:line="480" w:lineRule="auto"/>
+            <w:jc w:val="center"/>
+            <w:rPr>
+              <w:b/>
+              <w:bCs/>
+              <w:sz w:val="26"/>
+              <w:szCs w:val="26"/>
+            </w:rPr>
+          </w:pPr>
+          <w:r>
+            <w:rPr>
+              <w:b/>
+              <w:bCs/>
+              <w:sz w:val="26"/>
+              <w:szCs w:val="26"/>
+            </w:rPr>
+            <w:t>BORDEREAU DE RESERVES</w:t>
+          </w:r>
+        </w:p>
+      </w:tc>
+      <w:tc>
+        <w:tcPr>
+          <w:tcW w:w="3137" w:type="dxa"/>
           <w:tcBorders>
             <w:top w:val="single" w:sz="4" w:space="0" w:color="auto"/>
             <w:left w:val="single" w:sz="4" w:space="0" w:color="auto"/>
@@ -420,7 +539,7 @@
               <w:sz w:val="26"/>
               <w:szCs w:val="26"/>
             </w:rPr>
-            <w:t>Code : ERG 05/08-a</w:t>
+            <w:t>Date : Février 2014</w:t>
           </w:r>
         </w:p>
       </w:tc>
@@ -428,11 +547,11 @@
     <w:tr>
       <w:trPr>
         <w:cantSplit/>
-        <w:trHeight w:val="177"/>
+        <w:trHeight w:val="314"/>
       </w:trPr>
       <w:tc>
         <w:tcPr>
-          <w:tcW w:w="0" w:type="auto"/>
+          <w:tcW w:w="1506" w:type="dxa"/>
           <w:vMerge/>
           <w:tcBorders>
             <w:top w:val="single" w:sz="4" w:space="0" w:color="auto"/>
@@ -456,112 +575,7 @@
       </w:tc>
       <w:tc>
         <w:tcPr>
-          <w:tcW w:w="5165" w:type="dxa"/>
-          <w:vMerge w:val="restart"/>
-          <w:tcBorders>
-            <w:top w:val="single" w:sz="4" w:space="0" w:color="auto"/>
-            <w:left w:val="single" w:sz="4" w:space="0" w:color="auto"/>
-            <w:bottom w:val="single" w:sz="4" w:space="0" w:color="auto"/>
-            <w:right w:val="single" w:sz="4" w:space="0" w:color="auto"/>
-          </w:tcBorders>
-          <w:vAlign w:val="center"/>
-        </w:tcPr>
-        <w:p>
-          <w:pPr>
-            <w:spacing w:line="276" w:lineRule="auto"/>
-            <w:jc w:val="center"/>
-            <w:rPr>
-              <w:b/>
-              <w:bCs/>
-              <w:sz w:val="26"/>
-              <w:szCs w:val="26"/>
-            </w:rPr>
-          </w:pPr>
-        </w:p>
-        <w:p>
-          <w:pPr>
-            <w:spacing w:line="276" w:lineRule="auto"/>
-            <w:jc w:val="center"/>
-            <w:rPr>
-              <w:b/>
-              <w:bCs/>
-              <w:sz w:val="26"/>
-              <w:szCs w:val="26"/>
-            </w:rPr>
-          </w:pPr>
-          <w:r>
-            <w:rPr>
-              <w:b/>
-              <w:bCs/>
-              <w:sz w:val="26"/>
-              <w:szCs w:val="26"/>
-            </w:rPr>
-            <w:t>BORDEREAU DE RESERVES</w:t>
-          </w:r>
-        </w:p>
-      </w:tc>
-      <w:tc>
-        <w:tcPr>
-          <w:tcW w:w="2406" w:type="dxa"/>
-          <w:tcBorders>
-            <w:top w:val="single" w:sz="4" w:space="0" w:color="auto"/>
-            <w:left w:val="single" w:sz="4" w:space="0" w:color="auto"/>
-            <w:bottom w:val="single" w:sz="4" w:space="0" w:color="auto"/>
-            <w:right w:val="single" w:sz="4" w:space="0" w:color="auto"/>
-          </w:tcBorders>
-          <w:vAlign w:val="center"/>
-          <w:hideMark/>
-        </w:tcPr>
-        <w:p>
-          <w:pPr>
-            <w:spacing w:line="276" w:lineRule="auto"/>
-            <w:rPr>
-              <w:sz w:val="26"/>
-              <w:szCs w:val="26"/>
-            </w:rPr>
-          </w:pPr>
-          <w:r>
-            <w:rPr>
-              <w:sz w:val="26"/>
-              <w:szCs w:val="26"/>
-            </w:rPr>
-            <w:t>Date : Février 2014</w:t>
-          </w:r>
-        </w:p>
-      </w:tc>
-    </w:tr>
-    <w:tr>
-      <w:trPr>
-        <w:cantSplit/>
-        <w:trHeight w:val="332"/>
-      </w:trPr>
-      <w:tc>
-        <w:tcPr>
-          <w:tcW w:w="0" w:type="auto"/>
-          <w:vMerge/>
-          <w:tcBorders>
-            <w:top w:val="single" w:sz="4" w:space="0" w:color="auto"/>
-            <w:left w:val="single" w:sz="4" w:space="0" w:color="auto"/>
-            <w:bottom w:val="single" w:sz="4" w:space="0" w:color="auto"/>
-            <w:right w:val="single" w:sz="4" w:space="0" w:color="auto"/>
-          </w:tcBorders>
-          <w:vAlign w:val="center"/>
-          <w:hideMark/>
-        </w:tcPr>
-        <w:p>
-          <w:pPr>
-            <w:rPr>
-              <w:b/>
-              <w:bCs/>
-              <w:sz w:val="28"/>
-              <w:szCs w:val="28"/>
-            </w:rPr>
-          </w:pPr>
-        </w:p>
-      </w:tc>
-      <w:tc>
-        <w:tcPr>
-          <w:tcW w:w="0" w:type="auto"/>
+          <w:tcW w:w="5265" w:type="dxa"/>
           <w:vMerge/>
           <w:tcBorders>
             <w:top w:val="single" w:sz="4" w:space="0" w:color="auto"/>
@@ -586,7 +600,7 @@
       </w:tc>
       <w:tc>
         <w:tcPr>
-          <w:tcW w:w="2406" w:type="dxa"/>
+          <w:tcW w:w="3137" w:type="dxa"/>
           <w:tcBorders>
             <w:top w:val="single" w:sz="4" w:space="0" w:color="auto"/>
             <w:left w:val="single" w:sz="4" w:space="0" w:color="auto"/>
@@ -599,59 +613,174 @@
           <w:pPr>
             <w:spacing w:line="276" w:lineRule="auto"/>
             <w:rPr>
-              <w:sz w:val="26"/>
-              <w:szCs w:val="26"/>
+              <w:rFonts w:asciiTheme="majorBidi" w:hAnsiTheme="majorBidi" w:cstheme="majorBidi"/>
+              <w:b/>
+              <w:bCs/>
+              <w:sz w:val="18"/>
+              <w:szCs w:val="18"/>
             </w:rPr>
           </w:pPr>
           <w:r>
             <w:rPr>
-              <w:sz w:val="26"/>
-              <w:szCs w:val="26"/>
-            </w:rPr>
-            <w:t xml:space="preserve">Page </w:t>
-          </w:r>
-          <w:r>
-            <w:rPr>
-              <w:sz w:val="26"/>
-              <w:szCs w:val="26"/>
+              <w:rFonts w:asciiTheme="majorBidi" w:hAnsiTheme="majorBidi" w:cstheme="majorBidi"/>
+              <w:b/>
+              <w:bCs/>
+              <w:sz w:val="18"/>
+              <w:szCs w:val="18"/>
+            </w:rPr>
+            <w:t xml:space="preserve">Page  </w:t>
+          </w:r>
+          <w:r>
+            <w:rPr>
+              <w:rFonts w:asciiTheme="majorBidi" w:hAnsiTheme="majorBidi" w:cstheme="majorBidi"/>
+              <w:b/>
+              <w:bCs/>
+              <w:sz w:val="18"/>
+              <w:szCs w:val="18"/>
             </w:rPr>
             <w:fldChar w:fldCharType="begin"/>
           </w:r>
           <w:r>
             <w:rPr>
-              <w:sz w:val="26"/>
-              <w:szCs w:val="26"/>
-            </w:rPr>
-            <w:instrText xml:space="preserve"> PAGE </w:instrText>
-          </w:r>
-          <w:r>
-            <w:rPr>
-              <w:sz w:val="26"/>
-              <w:szCs w:val="26"/>
+              <w:rFonts w:asciiTheme="majorBidi" w:hAnsiTheme="majorBidi" w:cstheme="majorBidi"/>
+              <w:b/>
+              <w:bCs/>
+              <w:sz w:val="18"/>
+              <w:szCs w:val="18"/>
+            </w:rPr>
+            <w:instrText xml:space="preserve"> </w:instrText>
+          </w:r>
+          <w:r>
+            <w:rPr>
+              <w:rFonts w:asciiTheme="majorBidi" w:hAnsiTheme="majorBidi" w:cstheme="majorBidi"/>
+              <w:b/>
+              <w:bCs/>
+              <w:sz w:val="18"/>
+              <w:szCs w:val="18"/>
+            </w:rPr>
+            <w:instrText xml:space="preserve">PAGE </w:instrText>
+          </w:r>
+          <w:r>
+            <w:rPr>
+              <w:rFonts w:asciiTheme="majorBidi" w:hAnsiTheme="majorBidi" w:cstheme="majorBidi"/>
+              <w:b/>
+              <w:bCs/>
+              <w:sz w:val="18"/>
+              <w:szCs w:val="18"/>
             </w:rPr>
             <w:fldChar w:fldCharType="separate"/>
           </w:r>
           <w:r>
             <w:rPr>
+              <w:rFonts w:asciiTheme="majorBidi" w:hAnsiTheme="majorBidi" w:cstheme="majorBidi"/>
+              <w:b/>
+              <w:bCs/>
               <w:noProof/>
-              <w:sz w:val="26"/>
-              <w:szCs w:val="26"/>
+              <w:sz w:val="18"/>
+              <w:szCs w:val="18"/>
             </w:rPr>
             <w:t>1</w:t>
           </w:r>
           <w:r>
             <w:rPr>
-              <w:sz w:val="26"/>
-              <w:szCs w:val="26"/>
+              <w:rFonts w:asciiTheme="majorBidi" w:hAnsiTheme="majorBidi" w:cstheme="majorBidi"/>
+              <w:b/>
+              <w:bCs/>
+              <w:sz w:val="18"/>
+              <w:szCs w:val="18"/>
             </w:rPr>
             <w:fldChar w:fldCharType="end"/>
           </w:r>
           <w:r>
             <w:rPr>
-              <w:sz w:val="26"/>
-              <w:szCs w:val="26"/>
-            </w:rPr>
-            <w:t xml:space="preserve"> sur 5</w:t>
+              <w:rFonts w:asciiTheme="majorBidi" w:hAnsiTheme="majorBidi" w:cstheme="majorBidi"/>
+              <w:b/>
+              <w:bCs/>
+              <w:sz w:val="18"/>
+              <w:szCs w:val="18"/>
+            </w:rPr>
+            <w:t xml:space="preserve"> </w:t>
+          </w:r>
+          <w:r>
+            <w:rPr>
+              <w:rFonts w:asciiTheme="majorBidi" w:hAnsiTheme="majorBidi" w:cstheme="majorBidi"/>
+              <w:b/>
+              <w:bCs/>
+              <w:sz w:val="18"/>
+              <w:szCs w:val="18"/>
+            </w:rPr>
+            <w:t xml:space="preserve">sur </w:t>
+          </w:r>
+          <w:r>
+            <w:rPr>
+              <w:rFonts w:asciiTheme="majorBidi" w:hAnsiTheme="majorBidi" w:cstheme="majorBidi"/>
+              <w:b/>
+              <w:bCs/>
+              <w:sz w:val="18"/>
+              <w:szCs w:val="18"/>
+            </w:rPr>
+            <w:fldChar w:fldCharType="begin"/>
+          </w:r>
+          <w:r>
+            <w:rPr>
+              <w:rFonts w:asciiTheme="majorBidi" w:hAnsiTheme="majorBidi" w:cstheme="majorBidi"/>
+              <w:b/>
+              <w:bCs/>
+              <w:sz w:val="18"/>
+              <w:szCs w:val="18"/>
+            </w:rPr>
+            <w:instrText xml:space="preserve"> </w:instrText>
+          </w:r>
+          <w:r>
+            <w:rPr>
+              <w:rFonts w:asciiTheme="majorBidi" w:hAnsiTheme="majorBidi" w:cstheme="majorBidi"/>
+              <w:b/>
+              <w:bCs/>
+              <w:sz w:val="18"/>
+              <w:szCs w:val="18"/>
+            </w:rPr>
+            <w:instrText>NUMPAGES</w:instrText>
+          </w:r>
+          <w:r>
+            <w:rPr>
+              <w:rFonts w:asciiTheme="majorBidi" w:hAnsiTheme="majorBidi" w:cstheme="majorBidi"/>
+              <w:b/>
+              <w:bCs/>
+              <w:sz w:val="18"/>
+              <w:szCs w:val="18"/>
+            </w:rPr>
+            <w:instrText xml:space="preserve"> </w:instrText>
+          </w:r>
+          <w:r>
+            <w:rPr>
+              <w:rFonts w:asciiTheme="majorBidi" w:hAnsiTheme="majorBidi" w:cstheme="majorBidi"/>
+              <w:b/>
+              <w:bCs/>
+              <w:sz w:val="18"/>
+              <w:szCs w:val="18"/>
+            </w:rPr>
+            <w:fldChar w:fldCharType="separate"/>
+          </w:r>
+          <w:r>
+            <w:rPr>
+              <w:rFonts w:asciiTheme="majorBidi" w:hAnsiTheme="majorBidi" w:cstheme="majorBidi"/>
+              <w:b/>
+              <w:bCs/>
+              <w:noProof/>
+              <w:sz w:val="18"/>
+              <w:szCs w:val="18"/>
+            </w:rPr>
+            <w:t>2</w:t>
+          </w:r>
+          <w:r>
+            <w:rPr>
+              <w:rFonts w:asciiTheme="majorBidi" w:hAnsiTheme="majorBidi" w:cstheme="majorBidi"/>
+              <w:b/>
+              <w:bCs/>
+              <w:sz w:val="18"/>
+              <w:szCs w:val="18"/>
+            </w:rPr>
+            <w:fldChar w:fldCharType="end"/>
           </w:r>
         </w:p>
       </w:tc>
@@ -682,7 +811,12 @@
   </w:p>
   <w:p>
     <w:pPr>
-      <w:rPr>
+      <w:spacing w:before="240"/>
+      <w:rPr>
+        <w:b/>
+        <w:bCs/>
+        <w:sz w:val="28"/>
+        <w:szCs w:val="28"/>
         <w:lang w:val="en-US"/>
       </w:rPr>
     </w:pPr>
@@ -758,7 +892,7 @@
         <w:szCs w:val="28"/>
         <w:lang w:val="en-US"/>
       </w:rPr>
-      <w:t xml:space="preserve">                </w:t>
+      <w:t xml:space="preserve">             </w:t>
     </w:r>
     <w:r>
       <w:rPr>
@@ -768,37 +902,7 @@
         <w:szCs w:val="28"/>
         <w:lang w:val="en-US"/>
       </w:rPr>
-      <w:t xml:space="preserve">    </w:t>
-    </w:r>
-    <w:r>
-      <w:rPr>
-        <w:b/>
-        <w:bCs/>
-        <w:sz w:val="28"/>
-        <w:szCs w:val="28"/>
-        <w:lang w:val="en-US"/>
-      </w:rPr>
-      <w:t xml:space="preserve">       </w:t>
-    </w:r>
-    <w:r>
-      <w:rPr>
-        <w:b/>
-        <w:bCs/>
-        <w:sz w:val="28"/>
-        <w:szCs w:val="28"/>
-        <w:lang w:val="en-US"/>
-      </w:rPr>
-      <w:t xml:space="preserve">  </w:t>
-    </w:r>
-    <w:r>
-      <w:rPr>
-        <w:b/>
-        <w:bCs/>
-        <w:sz w:val="28"/>
-        <w:szCs w:val="28"/>
-        <w:lang w:val="en-US"/>
-      </w:rPr>
-      <w:t xml:space="preserve">        </w:t>
+      <w:t xml:space="preserve"> </w:t>
     </w:r>
     <w:r>
       <w:rPr>
@@ -819,7 +923,7 @@
         <w:szCs w:val="28"/>
         <w:lang w:val="en-US"/>
       </w:rPr>
-      <w:t xml:space="preserve">: </w:t>
+      <w:t>:</w:t>
     </w:r>
     <w:r>
       <w:rPr>
@@ -829,7 +933,7 @@
         <w:szCs w:val="28"/>
         <w:lang w:val="en-US"/>
       </w:rPr>
-      <w:t xml:space="preserve">  </w:t>
+      <w:t xml:space="preserve"> </w:t>
     </w:r>
     <w:r>
       <w:rPr>
@@ -839,7 +943,7 @@
         <w:szCs w:val="28"/>
         <w:lang w:val="en-US"/>
       </w:rPr>
-      <w:t>/0</w:t>
+      <w:t>XX</w:t>
     </w:r>
     <w:r>
       <w:rPr>
@@ -849,7 +953,7 @@
         <w:szCs w:val="28"/>
         <w:lang w:val="en-US"/>
       </w:rPr>
-      <w:t xml:space="preserve"> </w:t>
+      <w:t>/</w:t>
     </w:r>
     <w:r>
       <w:rPr>
@@ -859,26 +963,38 @@
         <w:szCs w:val="28"/>
         <w:lang w:val="en-US"/>
       </w:rPr>
-      <w:t>/202</w:t>
-    </w:r>
-  </w:p>
-  <w:p>
-    <w:pPr>
-      <w:pStyle w:val="Header"/>
-      <w:rPr>
-        <w:lang w:val="en-US"/>
-      </w:rPr>
-    </w:pPr>
-  </w:p>
-</w:hdr>
-</file>
-
-<file path=word/header3.xml><?xml version="1.0" encoding="utf-8"?>
-<w:hdr xmlns:wpc="http://schemas.microsoft.com/office/word/2010/wordprocessingCanvas" xmlns:cx="http://schemas.microsoft.com/office/drawing/2014/chartex" xmlns:cx1="http://schemas.microsoft.com/office/drawing/2015/9/8/chartex" xmlns:cx2="http://schemas.microsoft.com/office/drawing/2015/10/21/chartex" xmlns:cx3="http://schemas.microsoft.com/office/drawing/2016/5/9/chartex" xmlns:cx4="http://schemas.microsoft.com/office/drawing/2016/5/10/chartex" xmlns:cx5="http://schemas.microsoft.com/office/drawing/2016/5/11/chartex" xmlns:cx6="http://schemas.microsoft.com/office/drawing/2016/5/12/chartex" xmlns:cx7="http://schemas.microsoft.com/office/drawing/2016/5/13/chartex" xmlns:cx8="http://schemas.microsoft.com/office/drawing/2016/5/14/chartex" xmlns:mc="http://schemas.openxmlformats.org/markup-compatibility/2006" xmlns:aink="http://schemas.microsoft.com/office/drawing/2016/ink" xmlns:am3d="http://schemas.microsoft.com/office/drawing/2017/model3d" xmlns:o="urn:schemas-microsoft-com:office:office" xmlns:r="http://schemas.openxmlformats.org/officeDocument/2006/relationships" xmlns:m="http://schemas.openxmlformats.org/officeDocument/2006/math" xmlns:v="urn:schemas-microsoft-com:vml" xmlns:wp14="http://schemas.microsoft.com/office/word/2010/wordprocessingDrawing" xmlns:wp="http://schemas.openxmlformats.org/drawingml/2006/wordprocessingDrawing" xmlns:w10="urn:schemas-microsoft-com:office:word" xmlns:w="http://schemas.openxmlformats.org/wordprocessingml/2006/main" xmlns:w14="http://schemas.microsoft.com/office/word/2010/wordml" xmlns:w15="http://schemas.microsoft.com/office/word/2012/wordml" xmlns:w16cid="http://schemas.microsoft.com/office/word/2016/wordml/cid" xmlns:w16se="http://schemas.microsoft.com/office/word/2015/wordml/symex" xmlns:wpg="http://schemas.microsoft.com/office/word/2010/wordprocessingGroup" xmlns:wpi="http://schemas.microsoft.com/office/word/2010/wordprocessingInk" xmlns:wne="http://schemas.microsoft.com/office/word/2006/wordml" xmlns:wps="http://schemas.microsoft.com/office/word/2010/wordprocessingShape" mc:Ignorable="w14 w15 w16se w16cid wp14">
-  <w:p>
-    <w:pPr>
-      <w:pStyle w:val="Header"/>
-    </w:pPr>
+      <w:t>XX</w:t>
+    </w:r>
+    <w:r>
+      <w:rPr>
+        <w:b/>
+        <w:bCs/>
+        <w:sz w:val="28"/>
+        <w:szCs w:val="28"/>
+        <w:lang w:val="en-US"/>
+      </w:rPr>
+      <w:t>/20</w:t>
+    </w:r>
+    <w:r>
+      <w:rPr>
+        <w:b/>
+        <w:bCs/>
+        <w:sz w:val="28"/>
+        <w:szCs w:val="28"/>
+        <w:lang w:val="en-US"/>
+      </w:rPr>
+      <w:t>XX</w:t>
+    </w:r>
+    <w:r>
+      <w:rPr>
+        <w:b/>
+        <w:bCs/>
+        <w:sz w:val="28"/>
+        <w:szCs w:val="28"/>
+        <w:lang w:val="en-US"/>
+      </w:rPr>
+      <w:t xml:space="preserve">       </w:t>
+    </w:r>
   </w:p>
 </w:hdr>
 </file>
@@ -1055,7 +1171,7 @@
     <w:lsdException w:name="Table Web 2" w:semiHidden="1" w:unhideWhenUsed="1"/>
     <w:lsdException w:name="Table Web 3" w:semiHidden="1" w:unhideWhenUsed="1"/>
     <w:lsdException w:name="Balloon Text" w:semiHidden="1" w:uiPriority="0" w:unhideWhenUsed="1"/>
-    <w:lsdException w:name="Table Grid" w:semiHidden="1" w:uiPriority="39" w:unhideWhenUsed="1"/>
+    <w:lsdException w:name="Table Grid" w:uiPriority="39"/>
     <w:lsdException w:name="Table Theme" w:semiHidden="1" w:unhideWhenUsed="1"/>
     <w:lsdException w:name="Placeholder Text" w:semiHidden="1"/>
     <w:lsdException w:name="No Spacing" w:uiPriority="1" w:qFormat="1"/>
@@ -1702,4 +1818,16 @@
     </a:ext>
   </a:extLst>
 </a:theme>
+</file>
+
+<file path=customXml/item1.xml><?xml version="1.0" encoding="utf-8"?>
+<b:Sources xmlns:b="http://schemas.openxmlformats.org/officeDocument/2006/bibliography" xmlns="http://schemas.openxmlformats.org/officeDocument/2006/bibliography" SelectedStyle="\APASixthEditionOfficeOnline.xsl" StyleName="APA" Version="6"/>
+</file>
+
+<file path=customXml/itemProps1.xml><?xml version="1.0" encoding="utf-8"?>
+<ds:datastoreItem xmlns:ds="http://schemas.openxmlformats.org/officeDocument/2006/customXml" ds:itemID="{F6C77AD5-3C71-4B2D-8892-1F37B6CD4714}">
+  <ds:schemaRefs>
+    <ds:schemaRef ds:uri="http://schemas.openxmlformats.org/officeDocument/2006/bibliography"/>
+  </ds:schemaRefs>
+</ds:datastoreItem>
 </file>
</xml_diff>